<commit_message>
docs(cifie): clarify gaussian noise intuition in LIME perturbation step (8738 words)
</commit_message>
<xml_diff>
--- a/publications/book_chapters/2026_cifie_xai_fom7/drafts/v3_editorial_review/cifie_xai_fom7_2026-10-10.docx
+++ b/publications/book_chapters/2026_cifie_xai_fom7/drafts/v3_editorial_review/cifie_xai_fom7_2026-10-10.docx
@@ -52,7 +52,7 @@
         <w:rPr>
           <w:color w:val="000000"/>
         </w:rPr>
-        <w:t xml:space="preserve">8,709 palabras</w:t>
+        <w:t xml:space="preserve">8,738 palabras</w:t>
       </w:r>
     </w:p>
     <w:bookmarkStart w:id="11" w:name="resumen-y-palabras-clave"/>
@@ -3252,7 +3252,7 @@
         <w:rPr>
           <w:color w:val="000000"/>
         </w:rPr>
-        <w:t xml:space="preserve">en el entorno de</w:t>
+        <w:t xml:space="preserve">en el entorno inmediato de</w:t>
       </w:r>
       <w:r>
         <w:rPr>
@@ -3275,7 +3275,87 @@
         <w:rPr>
           <w:color w:val="000000"/>
         </w:rPr>
-        <w:t xml:space="preserve">aplicando ruido gaussiano sobre variables continuas y remuestreo sobre categóricas.</w:t>
+        <w:t xml:space="preserve">aplicando</w:t>
+      </w:r>
+      <w:r>
+        <w:rPr>
+          <w:color w:val="000000"/>
+        </w:rPr>
+        <w:t xml:space="preserve"> </w:t>
+      </w:r>
+      <w:r>
+        <w:rPr>
+          <w:b/>
+          <w:bCs/>
+          <w:color w:val="000000"/>
+        </w:rPr>
+        <w:t xml:space="preserve">ruido gaussiano</w:t>
+      </w:r>
+      <w:r>
+        <w:rPr>
+          <w:color w:val="000000"/>
+        </w:rPr>
+        <w:t xml:space="preserve"> </w:t>
+      </w:r>
+      <w:r>
+        <w:rPr>
+          <w:color w:val="000000"/>
+        </w:rPr>
+        <w:t xml:space="preserve">(pequeñas fluctuaciones aleatorias centradas en cero extraídas de una distribución normal,</w:t>
+      </w:r>
+      <w:r>
+        <w:rPr>
+          <w:color w:val="000000"/>
+        </w:rPr>
+        <w:t xml:space="preserve"> </w:t>
+      </w:r>
+      <m:oMath>
+        <m:r>
+          <m:rPr>
+            <m:scr m:val="script"/>
+            <m:sty m:val="p"/>
+          </m:rPr>
+          <m:t>N</m:t>
+        </m:r>
+        <m:r>
+          <m:rPr>
+            <m:sty m:val="p"/>
+          </m:rPr>
+          <m:t>(</m:t>
+        </m:r>
+        <m:r>
+          <m:t>0</m:t>
+        </m:r>
+        <m:r>
+          <m:rPr>
+            <m:sty m:val="p"/>
+          </m:rPr>
+          <m:t>,</m:t>
+        </m:r>
+        <m:sSup>
+          <m:e>
+            <m:r>
+              <m:t>σ</m:t>
+            </m:r>
+          </m:e>
+          <m:sup>
+            <m:r>
+              <m:t>2</m:t>
+            </m:r>
+          </m:sup>
+        </m:sSup>
+        <m:r>
+          <m:rPr>
+            <m:sty m:val="p"/>
+          </m:rPr>
+          <m:t>)</m:t>
+        </m:r>
+      </m:oMath>
+      <w:r>
+        <w:rPr>
+          <w:color w:val="000000"/>
+        </w:rPr>
+        <w:t xml:space="preserve">, que generan registros ligeramente modificados o «gemelos con ruido») sobre las variables continuas, y remuestreo empírico sobre las categóricas.</w:t>
       </w:r>
       <w:r>
         <w:rPr>

</xml_diff>